<commit_message>
docs: 完整註明原專案出處 (bherbruck/solidcraft) 與 Apache-2.0 / MIT 授權致謝
</commit_message>
<xml_diff>
--- a/SolidCraft_3D_CAD_繁體中文使用說明書.docx
+++ b/SolidCraft_3D_CAD_繁體中文使用說明書.docx
@@ -81,6 +81,108 @@
         <w:gridCol w:w="4968"/>
         <w:gridCol w:w="4968"/>
       </w:tblGrid>
+      <w:tr>
+        <w:tc>
+          <w:tcPr>
+            <w:tcW w:type="dxa" w:w="4968"/>
+            <w:shd w:fill="F1F5F9"/>
+            <w:tcMar>
+              <w:top w:w="60" w:type="dxa"/>
+              <w:bottom w:w="60" w:type="dxa"/>
+              <w:left w:w="100" w:type="dxa"/>
+              <w:right w:w="100" w:type="dxa"/>
+            </w:tcMar>
+          </w:tcPr>
+          <w:p>
+            <w:pPr>
+              <w:spacing w:after="40"/>
+            </w:pPr>
+            <w:r>
+              <w:rPr>
+                <w:b/>
+                <w:color w:val="475569"/>
+                <w:sz w:val="19"/>
+              </w:rPr>
+              <w:t>原專案出處</w:t>
+            </w:r>
+          </w:p>
+        </w:tc>
+        <w:tc>
+          <w:tcPr>
+            <w:tcW w:type="dxa" w:w="4968"/>
+            <w:shd w:fill="F8FAFC"/>
+            <w:tcMar>
+              <w:top w:w="60" w:type="dxa"/>
+              <w:bottom w:w="60" w:type="dxa"/>
+              <w:left w:w="100" w:type="dxa"/>
+              <w:right w:w="100" w:type="dxa"/>
+            </w:tcMar>
+          </w:tcPr>
+          <w:p>
+            <w:pPr>
+              <w:spacing w:after="40"/>
+            </w:pPr>
+            <w:r>
+              <w:rPr>
+                <w:color w:val="1E293B"/>
+                <w:sz w:val="19"/>
+              </w:rPr>
+              <w:t>bherbruck/solidcraft (原創作者: bherbruck 與 SolidCraft Contributors)</w:t>
+            </w:r>
+          </w:p>
+        </w:tc>
+      </w:tr>
+      <w:tr>
+        <w:tc>
+          <w:tcPr>
+            <w:tcW w:type="dxa" w:w="4968"/>
+            <w:shd w:fill="F1F5F9"/>
+            <w:tcMar>
+              <w:top w:w="60" w:type="dxa"/>
+              <w:bottom w:w="60" w:type="dxa"/>
+              <w:left w:w="100" w:type="dxa"/>
+              <w:right w:w="100" w:type="dxa"/>
+            </w:tcMar>
+          </w:tcPr>
+          <w:p>
+            <w:pPr>
+              <w:spacing w:after="40"/>
+            </w:pPr>
+            <w:r>
+              <w:rPr>
+                <w:b/>
+                <w:color w:val="475569"/>
+                <w:sz w:val="19"/>
+              </w:rPr>
+              <w:t>官方網站</w:t>
+            </w:r>
+          </w:p>
+        </w:tc>
+        <w:tc>
+          <w:tcPr>
+            <w:tcW w:type="dxa" w:w="4968"/>
+            <w:shd w:fill="F8FAFC"/>
+            <w:tcMar>
+              <w:top w:w="60" w:type="dxa"/>
+              <w:bottom w:w="60" w:type="dxa"/>
+              <w:left w:w="100" w:type="dxa"/>
+              <w:right w:w="100" w:type="dxa"/>
+            </w:tcMar>
+          </w:tcPr>
+          <w:p>
+            <w:pPr>
+              <w:spacing w:after="40"/>
+            </w:pPr>
+            <w:r>
+              <w:rPr>
+                <w:color w:val="1E293B"/>
+                <w:sz w:val="19"/>
+              </w:rPr>
+              <w:t>https://solidcraft.io · 雙重開源授權 (Apache-2.0 / MIT)</w:t>
+            </w:r>
+          </w:p>
+        </w:tc>
+      </w:tr>
       <w:tr>
         <w:tc>
           <w:tcPr>
@@ -309,6 +411,63 @@
         <w:t>SolidCraft 是一款全新世代、乾淨架構（Clean-room）、純 Rust 語言打造的開源參數化 3D CAD 電腦輔助設計軟體。相較於依賴商業授權或老舊架構的傳統 CAD 工具，SolidCraft 具備極速啟動、記憶體安全保證、跨平台原生渲染以及強大的 AI 代理人驅動介面（Model Context Protocol）。</w:t>
       </w:r>
     </w:p>
+    <w:tbl>
+      <w:tblPr>
+        <w:tblW w:type="auto" w:w="0"/>
+        <w:jc w:val="center"/>
+        <w:tblLook w:firstColumn="1" w:firstRow="1" w:lastColumn="0" w:lastRow="0" w:noHBand="0" w:noVBand="1" w:val="04A0"/>
+      </w:tblPr>
+      <w:tblGrid>
+        <w:gridCol w:w="9936"/>
+      </w:tblGrid>
+      <w:tr>
+        <w:tc>
+          <w:tcPr>
+            <w:tcW w:type="dxa" w:w="9936"/>
+            <w:shd w:fill="F0F9FF"/>
+            <w:tcMar>
+              <w:top w:w="140" w:type="dxa"/>
+              <w:bottom w:w="140" w:type="dxa"/>
+              <w:left w:w="200" w:type="dxa"/>
+              <w:right w:w="200" w:type="dxa"/>
+            </w:tcMar>
+            <w:tcBorders>
+              <w:left w:val="single" w:sz="24" w:space="0" w:color="0284C7"/>
+              <w:top w:val="none"/>
+              <w:right w:val="none"/>
+              <w:bottom w:val="none"/>
+            </w:tcBorders>
+          </w:tcPr>
+          <w:p>
+            <w:pPr>
+              <w:spacing w:before="40" w:after="40"/>
+            </w:pPr>
+            <w:r>
+              <w:rPr>
+                <w:rFonts w:ascii="Microsoft JhengHei" w:hAnsi="Microsoft JhengHei"/>
+                <w:b/>
+                <w:color w:val="0284C7"/>
+                <w:sz w:val="21"/>
+              </w:rPr>
+              <w:t>📌 原專案出處與致謝 (Credits &amp; Attribution)：</w:t>
+            </w:r>
+            <w:r>
+              <w:rPr>
+                <w:rFonts w:ascii="Microsoft JhengHei" w:hAnsi="Microsoft JhengHei"/>
+                <w:color w:val="323C4B"/>
+                <w:sz w:val="20"/>
+              </w:rPr>
+              <w:t>本繁體中文維護版本源自國外優秀開源專案 bherbruck/solidcraft（GitHub 倉庫: https://github.com/bherbruck/solidcraft，官方網站: https://solidcraft.io），原創作者為 bherbruck 與廣大開源貢獻者，全案採用 Apache-2.0 / MIT 雙重自由開源授權。本專案致力於將原作者傑出的 Rust 參數化 CAD 成果引進台灣與繁體中文社群，特此對原創作者致以最崇高的敬意。</w:t>
+            </w:r>
+          </w:p>
+        </w:tc>
+      </w:tr>
+    </w:tbl>
+    <w:p>
+      <w:pPr>
+        <w:spacing w:after="80"/>
+      </w:pPr>
+    </w:p>
     <w:p>
       <w:r>
         <w:t>本專案已由工程團隊進行深度在地化調校，將全系統 3,142 條操作文字、圖表說明與選單標籤全部轉換為標準「台灣繁體中文」，並將所有幾何約束、特徵生成、歷史樹與檔案操作術語，嚴格依照台灣機械與工業設計慣用標準統一。</w:t>
@@ -403,7 +562,7 @@
     </w:p>
     <w:p>
       <w:r>
-        <w:t>• 安裝檔案：SolidCraft-v0.22.1-繁體中文安裝檔.exe</w:t>
+        <w:t>• 安裝檔案：SolidCraft-v0.22.1-zh-TW-Setup.exe</w:t>
         <w:br/>
         <w:t>• 特點：具備標準 Windows 繁體中文安裝精靈，自動將程式安裝至 Program Files、建立桌面捷徑與開始功能表捷徑，並自動將 solidcraft 與 solidcraft-cli 加入系統 PATH 環境變數，亦支援 .solidcraft 設計檔案關聯。</w:t>
       </w:r>
@@ -422,7 +581,7 @@
     </w:p>
     <w:p>
       <w:r>
-        <w:t>• 封裝檔案：SolidCraft-v0.22.1-繁體中文免安裝版.zip</w:t>
+        <w:t>• 封裝檔案：SolidCraft-v0.22.1-zh-TW-Portable.zip</w:t>
         <w:br/>
         <w:t>• 特點：隨插即用，解壓縮至隨身碟或任意磁碟資料夾即可使用。內附「啟動SolidCraft.bat」與「一鍵建立桌面捷徑.bat」，適合校園電腦教室或無系統管理員權限之環境。</w:t>
       </w:r>

</xml_diff>